<commit_message>
Add dynamic market data architecture for compensation skill
</commit_message>
<xml_diff>
--- a/assets/generated-band-sample/compensation-band-offer-review.docx
+++ b/assets/generated-band-sample/compensation-band-offer-review.docx
@@ -156,6 +156,26 @@
           </w:p>
         </w:tc>
       </w:tr>
+      <w:tr>
+        <w:tc>
+          <w:p>
+            <w:r>
+              <w:rPr>
+                <w:b/>
+                <w:bCs/>
+              </w:rPr>
+              <w:t xml:space="preserve">建议强度</w:t>
+            </w:r>
+          </w:p>
+        </w:tc>
+        <w:tc>
+          <w:p>
+            <w:r>
+              <w:t xml:space="preserve">弱建议</w:t>
+            </w:r>
+          </w:p>
+        </w:tc>
+      </w:tr>
     </w:tbl>
     <w:p>
       <w:pPr>
@@ -228,6 +248,19 @@
         <w:spacing w:after="120"/>
       </w:pPr>
       <w:r>
+        <w:t xml:space="preserve">预算范围：未提供</w:t>
+      </w:r>
+    </w:p>
+    <w:p>
+      <w:pPr>
+        <w:pStyle w:val="ListParagraph"/>
+        <w:numPr>
+          <w:ilvl w:val="0"/>
+          <w:numId w:val="1"/>
+        </w:numPr>
+        <w:spacing w:after="120"/>
+      </w:pPr>
+      <w:r>
         <w:t xml:space="preserve">候选人期望位置：位于 band 上半段</w:t>
       </w:r>
     </w:p>
@@ -250,6 +283,19 @@
         <w:spacing w:after="120"/>
       </w:pPr>
       <w:r>
+        <w:t xml:space="preserve">建议强度：弱建议</w:t>
+      </w:r>
+    </w:p>
+    <w:p>
+      <w:pPr>
+        <w:pStyle w:val="ListParagraph"/>
+        <w:numPr>
+          <w:ilvl w:val="0"/>
+          <w:numId w:val="1"/>
+        </w:numPr>
+        <w:spacing w:after="120"/>
+      </w:pPr>
+      <w:r>
         <w:t xml:space="preserve">建议：建议按 band 中高位定薪</w:t>
       </w:r>
     </w:p>
@@ -303,6 +349,19 @@
       </w:pPr>
       <w:r>
         <w:t xml:space="preserve">市场备注：市场样本以近 12 个月互联网增长产品岗位为主，头部平台给价更高。</w:t>
+      </w:r>
+    </w:p>
+    <w:p>
+      <w:pPr>
+        <w:pStyle w:val="ListParagraph"/>
+        <w:numPr>
+          <w:ilvl w:val="0"/>
+          <w:numId w:val="1"/>
+        </w:numPr>
+        <w:spacing w:after="120"/>
+      </w:pPr>
+      <w:r>
+        <w:t xml:space="preserve">仍缺信息：缺少预算范围</w:t>
       </w:r>
     </w:p>
     <w:sectPr>

</xml_diff>